<commit_message>
fix: Update team member name to Trần Lê Thái Học across UI and documentation
</commit_message>
<xml_diff>
--- a/docs/BaoCao_Nhom7_CustomerInsightAI.docx
+++ b/docs/BaoCao_Nhom7_CustomerInsightAI.docx
@@ -771,12 +771,7 @@
           </w:tcPr>
           <w:p>
             <w:r>
-              <w:rPr>
-                <w:rFonts w:ascii="Times New Roman" w:hAnsi="Times New Roman"/>
-                <w:color w:val="1E293B"/>
-                <w:sz w:val="22"/>
-              </w:rPr>
-              <w:t>Nguyễn Thái Học</w:t>
+              <w:t>Trần Lê Thái Học</w:t>
             </w:r>
           </w:p>
         </w:tc>

</xml_diff>